<commit_message>
Remove literal # prefix from bar number placeholders in 43 templates
The # symbol is already inferred/included with the bar number value
itself, so templates should not have a literal # before {{..._bar}}
placeholders. Batch-fixed all 43 templates containing #{{...bar...}}
patterns.

Co-Authored-By: Claude Opus 4.6 <noreply@anthropic.com>
</commit_message>
<xml_diff>
--- a/data/templates/Admin_Hearing_Request.docx
+++ b/data/templates/Admin_Hearing_Request.docx
@@ -657,7 +657,7 @@
         </w:rPr>
         <w:t>{{attorney_name}}</w:t>
         <w:tab/>
-        <w:t>#{{attorney_bar}}</w:t>
+        <w:t>{{attorney_bar}}</w:t>
       </w:r>
     </w:p>
     <w:p>
@@ -685,7 +685,7 @@
         <w:t>{{co_counsel_name}}</w:t>
         <w:tab/>
         <w:tab/>
-        <w:t>#{{co_counsel_bar}}</w:t>
+        <w:t>{{co_counsel_bar}}</w:t>
       </w:r>
     </w:p>
     <w:p>

</xml_diff>

<commit_message>
Remove all Facsimile/firm_fax references from 39 templates
- Removed {{firm_fax}} placeholders from 31 templates
- Removed orphaned "Facsimile:" label paragraphs from 8 templates
- Removed hardcoded firm fax number (314) 596-0658 from 12 templates
- Firm no longer uses fax; remaining "Via Facsimile" in Admin templates
  are DOR delivery instructions (kept intentionally)

Co-Authored-By: Claude Opus 4.6 <noreply@anthropic.com>
</commit_message>
<xml_diff>
--- a/data/templates/Admin_Hearing_Request.docx
+++ b/data/templates/Admin_Hearing_Request.docx
@@ -759,33 +759,6 @@
         <w:t>Telephone:</w:t>
         <w:tab/>
         <w:t>{{firm_phone}}</w:t>
-      </w:r>
-    </w:p>
-    <w:p>
-      <w:pPr>
-        <w:pStyle w:val="Normal"/>
-        <w:tabs>
-          <w:tab w:val="clear" w:pos="720"/>
-          <w:tab w:val="left" w:pos="-1440" w:leader="none"/>
-        </w:tabs>
-        <w:jc w:val="both"/>
-        <w:rPr>
-          <w:rFonts w:ascii="Century Gothic" w:hAnsi="Century Gothic" w:cs="Century Gothic"/>
-        </w:rPr>
-      </w:pPr>
-      <w:r>
-        <w:rPr>
-          <w:rFonts w:cs="Century Gothic" w:ascii="Century Gothic" w:hAnsi="Century Gothic"/>
-        </w:rPr>
-        <w:tab/>
-        <w:tab/>
-        <w:tab/>
-        <w:tab/>
-        <w:tab/>
-        <w:tab/>
-        <w:t>Facsimile:</w:t>
-        <w:tab/>
-        <w:t>{{firm_fax}}</w:t>
       </w:r>
     </w:p>
     <w:p>

</xml_diff>

<commit_message>
Fix 10 template placeholders + add comprehensive test harness
Template fixes (missing/fragmented placeholders):
- Motion to Withdraw Guilty Plea: add {{case_number}}
- Notice to Take Deposition: add {{deponent_name}}, {{deposition_location}}
- Request for Transcripts: add {{defendant_name}}
- After Supplemental Disclosure Letter: add {{disclosure_date}}
- Rec Letter to PA: fix {{court_name_short}} split across XML runs
- Requirements for Rec Letter to Client: add client placeholders
- Notice of Hearing: add {{hearing_time}}, {{division}}, {{hearing_date}}, {{motion_type}}
- NOH Motion to Withdraw: add {{hearing_time}}, {{hearing_date}}
- Request for Stay Order: add {{case_number}}
- Admin Hearing Request: remove fax references

New: tests/test_all_templates.py — covers all 55 template-backed
document types across 7 categories (1011 checks, all passing).

Co-Authored-By: Claude Opus 4.6 <noreply@anthropic.com>
</commit_message>
<xml_diff>
--- a/data/templates/Admin_Hearing_Request.docx
+++ b/data/templates/Admin_Hearing_Request.docx
@@ -81,7 +81,7 @@
         <w:rPr>
           <w:rFonts w:cs="Century Gothic" w:ascii="Century Gothic" w:hAnsi="Century Gothic"/>
         </w:rPr>
-        <w:t>Via Facsimile:  573-751-7151</w:t>
+        <w:t/>
       </w:r>
     </w:p>
     <w:p>
@@ -862,7 +862,7 @@
         <w:rPr>
           <w:rFonts w:cs="Century Gothic" w:ascii="Century Gothic" w:hAnsi="Century Gothic"/>
         </w:rPr>
-        <w:t xml:space="preserve">facsimile    </w:t>
+        <w:t/>
       </w:r>
     </w:p>
     <w:p>

</xml_diff>